<commit_message>
Agrega guiones H5P y guía de Level Up en inglés; entrega 04 con LEEME
Co-Authored-By: Claude Opus 5.5 <noreply@anthropic.com>
Claude-Session: https://claude.ai/code/session_01P5F6YBSbmgYFHyY7RUeBgK
</commit_message>
<xml_diff>
--- a/proyecto-inclusion-financiera/moodle/Guiones_H5P_ES.docx
+++ b/proyecto-inclusion-financiera/moodle/Guiones_H5P_ES.docx
@@ -751,7 +751,7 @@
         <w:pStyle w:val="Heading1"/>
       </w:pPr>
       <w:r>
-        <w:t xml:space="preserve">Módulo 1. Tu dinero hoy</w:t>
+        <w:t xml:space="preserve">Módulo 1. Entiende tu dinero y organiza tu economía</w:t>
       </w:r>
     </w:p>
     <w:p>
@@ -5136,7 +5136,7 @@
         <w:pStyle w:val="Heading1"/>
       </w:pPr>
       <w:r>
-        <w:t xml:space="preserve">Módulo 2. Tu cuenta y tus envíos</w:t>
+        <w:t xml:space="preserve">Módulo 2. Entiende el sistema financiero y planea tus remesas</w:t>
       </w:r>
     </w:p>
     <w:p>
@@ -9299,7 +9299,7 @@
         <w:pStyle w:val="Heading1"/>
       </w:pPr>
       <w:r>
-        <w:t xml:space="preserve">Módulo 3. Tu crédito</w:t>
+        <w:t xml:space="preserve">Módulo 3. Construye tu crédito y maneja tus deudas</w:t>
       </w:r>
     </w:p>
     <w:p>
@@ -11895,7 +11895,7 @@
         <w:pStyle w:val="Heading1"/>
       </w:pPr>
       <w:r>
-        <w:t xml:space="preserve">Módulo 4. Tu protección</w:t>
+        <w:t xml:space="preserve">Módulo 4. Protege tu dinero, tu identidad y tu familia</w:t>
       </w:r>
     </w:p>
     <w:p>
@@ -14842,7 +14842,7 @@
         <w:pStyle w:val="Heading1"/>
       </w:pPr>
       <w:r>
-        <w:t xml:space="preserve">Módulo 5. Tu futuro</w:t>
+        <w:t xml:space="preserve">Módulo 5. Construye patrimonio y prepara tu futuro</w:t>
       </w:r>
     </w:p>
     <w:p>

</xml_diff>